<commit_message>
feat: add py to analyse
</commit_message>
<xml_diff>
--- a/机器学习/ext-智能垃圾类型识别/analyse.docx
+++ b/机器学习/ext-智能垃圾类型识别/analyse.docx
@@ -9,6 +9,2828 @@
       </w:pPr>
       <w:r>
         <w:t xml:space="preserve">Reconnaissance du type de déchets intelligents : fichier d’entraînement du modèle et analyse technique</w:t>
+      </w:r>
+    </w:p>
+    <w:p>
+      <w:pPr>
+        <w:pStyle w:val="SourceCode"/>
+      </w:pPr>
+      <w:r>
+        <w:rPr>
+          <w:rStyle w:val="AttributeTok"/>
+        </w:rPr>
+        <w:t xml:space="preserve">@torch.no_grad</w:t>
+      </w:r>
+      <w:r>
+        <w:rPr>
+          <w:rStyle w:val="NormalTok"/>
+        </w:rPr>
+        <w:t xml:space="preserve">()</w:t>
+      </w:r>
+      <w:r>
+        <w:br/>
+      </w:r>
+      <w:r>
+        <w:rPr>
+          <w:rStyle w:val="KeywordTok"/>
+        </w:rPr>
+        <w:t xml:space="preserve">def</w:t>
+      </w:r>
+      <w:r>
+        <w:rPr>
+          <w:rStyle w:val="NormalTok"/>
+        </w:rPr>
+        <w:t xml:space="preserve"> evaluate(model: nn.Module, loader: DataLoader, device: torch.device) </w:t>
+      </w:r>
+      <w:r>
+        <w:rPr>
+          <w:rStyle w:val="OperatorTok"/>
+        </w:rPr>
+        <w:t xml:space="preserve">-&gt;</w:t>
+      </w:r>
+      <w:r>
+        <w:rPr>
+          <w:rStyle w:val="NormalTok"/>
+        </w:rPr>
+        <w:t xml:space="preserve"> </w:t>
+      </w:r>
+      <w:r>
+        <w:rPr>
+          <w:rStyle w:val="BuiltInTok"/>
+        </w:rPr>
+        <w:t xml:space="preserve">dict</w:t>
+      </w:r>
+      <w:r>
+        <w:rPr>
+          <w:rStyle w:val="NormalTok"/>
+        </w:rPr>
+        <w:t xml:space="preserve">:</w:t>
+      </w:r>
+      <w:r>
+        <w:br/>
+      </w:r>
+      <w:r>
+        <w:rPr>
+          <w:rStyle w:val="NormalTok"/>
+        </w:rPr>
+        <w:t xml:space="preserve">    model.</w:t>
+      </w:r>
+      <w:r>
+        <w:rPr>
+          <w:rStyle w:val="BuiltInTok"/>
+        </w:rPr>
+        <w:t xml:space="preserve">eval</w:t>
+      </w:r>
+      <w:r>
+        <w:rPr>
+          <w:rStyle w:val="NormalTok"/>
+        </w:rPr>
+        <w:t xml:space="preserve">()</w:t>
+      </w:r>
+      <w:r>
+        <w:br/>
+      </w:r>
+      <w:r>
+        <w:rPr>
+          <w:rStyle w:val="NormalTok"/>
+        </w:rPr>
+        <w:t xml:space="preserve">    loss_fn </w:t>
+      </w:r>
+      <w:r>
+        <w:rPr>
+          <w:rStyle w:val="OperatorTok"/>
+        </w:rPr>
+        <w:t xml:space="preserve">=</w:t>
+      </w:r>
+      <w:r>
+        <w:rPr>
+          <w:rStyle w:val="NormalTok"/>
+        </w:rPr>
+        <w:t xml:space="preserve"> nn.CrossEntropyLoss()</w:t>
+      </w:r>
+      <w:r>
+        <w:br/>
+      </w:r>
+      <w:r>
+        <w:rPr>
+          <w:rStyle w:val="NormalTok"/>
+        </w:rPr>
+        <w:t xml:space="preserve">    total_loss </w:t>
+      </w:r>
+      <w:r>
+        <w:rPr>
+          <w:rStyle w:val="OperatorTok"/>
+        </w:rPr>
+        <w:t xml:space="preserve">=</w:t>
+      </w:r>
+      <w:r>
+        <w:rPr>
+          <w:rStyle w:val="NormalTok"/>
+        </w:rPr>
+        <w:t xml:space="preserve"> </w:t>
+      </w:r>
+      <w:r>
+        <w:rPr>
+          <w:rStyle w:val="FloatTok"/>
+        </w:rPr>
+        <w:t xml:space="preserve">0.0</w:t>
+      </w:r>
+      <w:r>
+        <w:br/>
+      </w:r>
+      <w:r>
+        <w:rPr>
+          <w:rStyle w:val="NormalTok"/>
+        </w:rPr>
+        <w:t xml:space="preserve">    total_acc </w:t>
+      </w:r>
+      <w:r>
+        <w:rPr>
+          <w:rStyle w:val="OperatorTok"/>
+        </w:rPr>
+        <w:t xml:space="preserve">=</w:t>
+      </w:r>
+      <w:r>
+        <w:rPr>
+          <w:rStyle w:val="NormalTok"/>
+        </w:rPr>
+        <w:t xml:space="preserve"> </w:t>
+      </w:r>
+      <w:r>
+        <w:rPr>
+          <w:rStyle w:val="FloatTok"/>
+        </w:rPr>
+        <w:t xml:space="preserve">0.0</w:t>
+      </w:r>
+      <w:r>
+        <w:br/>
+      </w:r>
+      <w:r>
+        <w:rPr>
+          <w:rStyle w:val="NormalTok"/>
+        </w:rPr>
+        <w:t xml:space="preserve">    n_batches </w:t>
+      </w:r>
+      <w:r>
+        <w:rPr>
+          <w:rStyle w:val="OperatorTok"/>
+        </w:rPr>
+        <w:t xml:space="preserve">=</w:t>
+      </w:r>
+      <w:r>
+        <w:rPr>
+          <w:rStyle w:val="NormalTok"/>
+        </w:rPr>
+        <w:t xml:space="preserve"> </w:t>
+      </w:r>
+      <w:r>
+        <w:rPr>
+          <w:rStyle w:val="DecValTok"/>
+        </w:rPr>
+        <w:t xml:space="preserve">0</w:t>
+      </w:r>
+      <w:r>
+        <w:br/>
+      </w:r>
+      <w:r>
+        <w:br/>
+      </w:r>
+      <w:r>
+        <w:rPr>
+          <w:rStyle w:val="NormalTok"/>
+        </w:rPr>
+        <w:t xml:space="preserve">    all_preds </w:t>
+      </w:r>
+      <w:r>
+        <w:rPr>
+          <w:rStyle w:val="OperatorTok"/>
+        </w:rPr>
+        <w:t xml:space="preserve">=</w:t>
+      </w:r>
+      <w:r>
+        <w:rPr>
+          <w:rStyle w:val="NormalTok"/>
+        </w:rPr>
+        <w:t xml:space="preserve"> []</w:t>
+      </w:r>
+      <w:r>
+        <w:br/>
+      </w:r>
+      <w:r>
+        <w:rPr>
+          <w:rStyle w:val="NormalTok"/>
+        </w:rPr>
+        <w:t xml:space="preserve">    all_targets </w:t>
+      </w:r>
+      <w:r>
+        <w:rPr>
+          <w:rStyle w:val="OperatorTok"/>
+        </w:rPr>
+        <w:t xml:space="preserve">=</w:t>
+      </w:r>
+      <w:r>
+        <w:rPr>
+          <w:rStyle w:val="NormalTok"/>
+        </w:rPr>
+        <w:t xml:space="preserve"> []</w:t>
+      </w:r>
+      <w:r>
+        <w:br/>
+      </w:r>
+      <w:r>
+        <w:rPr>
+          <w:rStyle w:val="NormalTok"/>
+        </w:rPr>
+        <w:t xml:space="preserve">    </w:t>
+      </w:r>
+      <w:r>
+        <w:rPr>
+          <w:rStyle w:val="ControlFlowTok"/>
+        </w:rPr>
+        <w:t xml:space="preserve">for</w:t>
+      </w:r>
+      <w:r>
+        <w:rPr>
+          <w:rStyle w:val="NormalTok"/>
+        </w:rPr>
+        <w:t xml:space="preserve"> images, targets </w:t>
+      </w:r>
+      <w:r>
+        <w:rPr>
+          <w:rStyle w:val="KeywordTok"/>
+        </w:rPr>
+        <w:t xml:space="preserve">in</w:t>
+      </w:r>
+      <w:r>
+        <w:rPr>
+          <w:rStyle w:val="NormalTok"/>
+        </w:rPr>
+        <w:t xml:space="preserve"> loader:</w:t>
+      </w:r>
+      <w:r>
+        <w:br/>
+      </w:r>
+      <w:r>
+        <w:rPr>
+          <w:rStyle w:val="NormalTok"/>
+        </w:rPr>
+        <w:t xml:space="preserve">        images </w:t>
+      </w:r>
+      <w:r>
+        <w:rPr>
+          <w:rStyle w:val="OperatorTok"/>
+        </w:rPr>
+        <w:t xml:space="preserve">=</w:t>
+      </w:r>
+      <w:r>
+        <w:rPr>
+          <w:rStyle w:val="NormalTok"/>
+        </w:rPr>
+        <w:t xml:space="preserve"> images.to(device, non_blocking</w:t>
+      </w:r>
+      <w:r>
+        <w:rPr>
+          <w:rStyle w:val="OperatorTok"/>
+        </w:rPr>
+        <w:t xml:space="preserve">=</w:t>
+      </w:r>
+      <w:r>
+        <w:rPr>
+          <w:rStyle w:val="VariableTok"/>
+        </w:rPr>
+        <w:t xml:space="preserve">True</w:t>
+      </w:r>
+      <w:r>
+        <w:rPr>
+          <w:rStyle w:val="NormalTok"/>
+        </w:rPr>
+        <w:t xml:space="preserve">)</w:t>
+      </w:r>
+      <w:r>
+        <w:br/>
+      </w:r>
+      <w:r>
+        <w:rPr>
+          <w:rStyle w:val="NormalTok"/>
+        </w:rPr>
+        <w:t xml:space="preserve">        targets </w:t>
+      </w:r>
+      <w:r>
+        <w:rPr>
+          <w:rStyle w:val="OperatorTok"/>
+        </w:rPr>
+        <w:t xml:space="preserve">=</w:t>
+      </w:r>
+      <w:r>
+        <w:rPr>
+          <w:rStyle w:val="NormalTok"/>
+        </w:rPr>
+        <w:t xml:space="preserve"> targets.to(device, non_blocking</w:t>
+      </w:r>
+      <w:r>
+        <w:rPr>
+          <w:rStyle w:val="OperatorTok"/>
+        </w:rPr>
+        <w:t xml:space="preserve">=</w:t>
+      </w:r>
+      <w:r>
+        <w:rPr>
+          <w:rStyle w:val="VariableTok"/>
+        </w:rPr>
+        <w:t xml:space="preserve">True</w:t>
+      </w:r>
+      <w:r>
+        <w:rPr>
+          <w:rStyle w:val="NormalTok"/>
+        </w:rPr>
+        <w:t xml:space="preserve">)</w:t>
+      </w:r>
+      <w:r>
+        <w:br/>
+      </w:r>
+      <w:r>
+        <w:rPr>
+          <w:rStyle w:val="NormalTok"/>
+        </w:rPr>
+        <w:t xml:space="preserve">        logits </w:t>
+      </w:r>
+      <w:r>
+        <w:rPr>
+          <w:rStyle w:val="OperatorTok"/>
+        </w:rPr>
+        <w:t xml:space="preserve">=</w:t>
+      </w:r>
+      <w:r>
+        <w:rPr>
+          <w:rStyle w:val="NormalTok"/>
+        </w:rPr>
+        <w:t xml:space="preserve"> model(images)</w:t>
+      </w:r>
+      <w:r>
+        <w:br/>
+      </w:r>
+      <w:r>
+        <w:rPr>
+          <w:rStyle w:val="NormalTok"/>
+        </w:rPr>
+        <w:t xml:space="preserve">        loss </w:t>
+      </w:r>
+      <w:r>
+        <w:rPr>
+          <w:rStyle w:val="OperatorTok"/>
+        </w:rPr>
+        <w:t xml:space="preserve">=</w:t>
+      </w:r>
+      <w:r>
+        <w:rPr>
+          <w:rStyle w:val="NormalTok"/>
+        </w:rPr>
+        <w:t xml:space="preserve"> loss_fn(logits, targets)</w:t>
+      </w:r>
+      <w:r>
+        <w:br/>
+      </w:r>
+      <w:r>
+        <w:rPr>
+          <w:rStyle w:val="NormalTok"/>
+        </w:rPr>
+        <w:t xml:space="preserve">        total_loss </w:t>
+      </w:r>
+      <w:r>
+        <w:rPr>
+          <w:rStyle w:val="OperatorTok"/>
+        </w:rPr>
+        <w:t xml:space="preserve">+=</w:t>
+      </w:r>
+      <w:r>
+        <w:rPr>
+          <w:rStyle w:val="NormalTok"/>
+        </w:rPr>
+        <w:t xml:space="preserve"> loss.item()</w:t>
+      </w:r>
+      <w:r>
+        <w:br/>
+      </w:r>
+      <w:r>
+        <w:rPr>
+          <w:rStyle w:val="NormalTok"/>
+        </w:rPr>
+        <w:t xml:space="preserve">        total_acc </w:t>
+      </w:r>
+      <w:r>
+        <w:rPr>
+          <w:rStyle w:val="OperatorTok"/>
+        </w:rPr>
+        <w:t xml:space="preserve">+=</w:t>
+      </w:r>
+      <w:r>
+        <w:rPr>
+          <w:rStyle w:val="NormalTok"/>
+        </w:rPr>
+        <w:t xml:space="preserve"> accuracy_top1(logits, targets)</w:t>
+      </w:r>
+      <w:r>
+        <w:br/>
+      </w:r>
+      <w:r>
+        <w:rPr>
+          <w:rStyle w:val="NormalTok"/>
+        </w:rPr>
+        <w:t xml:space="preserve">        n_batches </w:t>
+      </w:r>
+      <w:r>
+        <w:rPr>
+          <w:rStyle w:val="OperatorTok"/>
+        </w:rPr>
+        <w:t xml:space="preserve">+=</w:t>
+      </w:r>
+      <w:r>
+        <w:rPr>
+          <w:rStyle w:val="NormalTok"/>
+        </w:rPr>
+        <w:t xml:space="preserve"> </w:t>
+      </w:r>
+      <w:r>
+        <w:rPr>
+          <w:rStyle w:val="DecValTok"/>
+        </w:rPr>
+        <w:t xml:space="preserve">1</w:t>
+      </w:r>
+      <w:r>
+        <w:br/>
+      </w:r>
+      <w:r>
+        <w:br/>
+      </w:r>
+      <w:r>
+        <w:rPr>
+          <w:rStyle w:val="NormalTok"/>
+        </w:rPr>
+        <w:t xml:space="preserve">        all_preds.append(logits.argmax(dim</w:t>
+      </w:r>
+      <w:r>
+        <w:rPr>
+          <w:rStyle w:val="OperatorTok"/>
+        </w:rPr>
+        <w:t xml:space="preserve">=</w:t>
+      </w:r>
+      <w:r>
+        <w:rPr>
+          <w:rStyle w:val="DecValTok"/>
+        </w:rPr>
+        <w:t xml:space="preserve">1</w:t>
+      </w:r>
+      <w:r>
+        <w:rPr>
+          <w:rStyle w:val="NormalTok"/>
+        </w:rPr>
+        <w:t xml:space="preserve">).detach().cpu())</w:t>
+      </w:r>
+      <w:r>
+        <w:br/>
+      </w:r>
+      <w:r>
+        <w:rPr>
+          <w:rStyle w:val="NormalTok"/>
+        </w:rPr>
+        <w:t xml:space="preserve">        all_targets.append(targets.detach().cpu())</w:t>
+      </w:r>
+      <w:r>
+        <w:br/>
+      </w:r>
+      <w:r>
+        <w:br/>
+      </w:r>
+      <w:r>
+        <w:rPr>
+          <w:rStyle w:val="NormalTok"/>
+        </w:rPr>
+        <w:t xml:space="preserve">    </w:t>
+      </w:r>
+      <w:r>
+        <w:rPr>
+          <w:rStyle w:val="ControlFlowTok"/>
+        </w:rPr>
+        <w:t xml:space="preserve">if</w:t>
+      </w:r>
+      <w:r>
+        <w:rPr>
+          <w:rStyle w:val="NormalTok"/>
+        </w:rPr>
+        <w:t xml:space="preserve"> n_batches </w:t>
+      </w:r>
+      <w:r>
+        <w:rPr>
+          <w:rStyle w:val="OperatorTok"/>
+        </w:rPr>
+        <w:t xml:space="preserve">==</w:t>
+      </w:r>
+      <w:r>
+        <w:rPr>
+          <w:rStyle w:val="NormalTok"/>
+        </w:rPr>
+        <w:t xml:space="preserve"> </w:t>
+      </w:r>
+      <w:r>
+        <w:rPr>
+          <w:rStyle w:val="DecValTok"/>
+        </w:rPr>
+        <w:t xml:space="preserve">0</w:t>
+      </w:r>
+      <w:r>
+        <w:rPr>
+          <w:rStyle w:val="NormalTok"/>
+        </w:rPr>
+        <w:t xml:space="preserve">:</w:t>
+      </w:r>
+      <w:r>
+        <w:br/>
+      </w:r>
+      <w:r>
+        <w:rPr>
+          <w:rStyle w:val="NormalTok"/>
+        </w:rPr>
+        <w:t xml:space="preserve">        </w:t>
+      </w:r>
+      <w:r>
+        <w:rPr>
+          <w:rStyle w:val="ControlFlowTok"/>
+        </w:rPr>
+        <w:t xml:space="preserve">return</w:t>
+      </w:r>
+      <w:r>
+        <w:rPr>
+          <w:rStyle w:val="NormalTok"/>
+        </w:rPr>
+        <w:t xml:space="preserve"> {</w:t>
+      </w:r>
+      <w:r>
+        <w:rPr>
+          <w:rStyle w:val="StringTok"/>
+        </w:rPr>
+        <w:t xml:space="preserve">"loss"</w:t>
+      </w:r>
+      <w:r>
+        <w:rPr>
+          <w:rStyle w:val="NormalTok"/>
+        </w:rPr>
+        <w:t xml:space="preserve">: </w:t>
+      </w:r>
+      <w:r>
+        <w:rPr>
+          <w:rStyle w:val="BuiltInTok"/>
+        </w:rPr>
+        <w:t xml:space="preserve">float</w:t>
+      </w:r>
+      <w:r>
+        <w:rPr>
+          <w:rStyle w:val="NormalTok"/>
+        </w:rPr>
+        <w:t xml:space="preserve">(</w:t>
+      </w:r>
+      <w:r>
+        <w:rPr>
+          <w:rStyle w:val="StringTok"/>
+        </w:rPr>
+        <w:t xml:space="preserve">"nan"</w:t>
+      </w:r>
+      <w:r>
+        <w:rPr>
+          <w:rStyle w:val="NormalTok"/>
+        </w:rPr>
+        <w:t xml:space="preserve">), </w:t>
+      </w:r>
+      <w:r>
+        <w:rPr>
+          <w:rStyle w:val="StringTok"/>
+        </w:rPr>
+        <w:t xml:space="preserve">"acc"</w:t>
+      </w:r>
+      <w:r>
+        <w:rPr>
+          <w:rStyle w:val="NormalTok"/>
+        </w:rPr>
+        <w:t xml:space="preserve">: </w:t>
+      </w:r>
+      <w:r>
+        <w:rPr>
+          <w:rStyle w:val="BuiltInTok"/>
+        </w:rPr>
+        <w:t xml:space="preserve">float</w:t>
+      </w:r>
+      <w:r>
+        <w:rPr>
+          <w:rStyle w:val="NormalTok"/>
+        </w:rPr>
+        <w:t xml:space="preserve">(</w:t>
+      </w:r>
+      <w:r>
+        <w:rPr>
+          <w:rStyle w:val="StringTok"/>
+        </w:rPr>
+        <w:t xml:space="preserve">"nan"</w:t>
+      </w:r>
+      <w:r>
+        <w:rPr>
+          <w:rStyle w:val="NormalTok"/>
+        </w:rPr>
+        <w:t xml:space="preserve">), </w:t>
+      </w:r>
+      <w:r>
+        <w:rPr>
+          <w:rStyle w:val="StringTok"/>
+        </w:rPr>
+        <w:t xml:space="preserve">"confusion"</w:t>
+      </w:r>
+      <w:r>
+        <w:rPr>
+          <w:rStyle w:val="NormalTok"/>
+        </w:rPr>
+        <w:t xml:space="preserve">: </w:t>
+      </w:r>
+      <w:r>
+        <w:rPr>
+          <w:rStyle w:val="VariableTok"/>
+        </w:rPr>
+        <w:t xml:space="preserve">None</w:t>
+      </w:r>
+      <w:r>
+        <w:rPr>
+          <w:rStyle w:val="NormalTok"/>
+        </w:rPr>
+        <w:t xml:space="preserve">}</w:t>
+      </w:r>
+      <w:r>
+        <w:br/>
+      </w:r>
+      <w:r>
+        <w:br/>
+      </w:r>
+      <w:r>
+        <w:rPr>
+          <w:rStyle w:val="NormalTok"/>
+        </w:rPr>
+        <w:t xml:space="preserve">    preds </w:t>
+      </w:r>
+      <w:r>
+        <w:rPr>
+          <w:rStyle w:val="OperatorTok"/>
+        </w:rPr>
+        <w:t xml:space="preserve">=</w:t>
+      </w:r>
+      <w:r>
+        <w:rPr>
+          <w:rStyle w:val="NormalTok"/>
+        </w:rPr>
+        <w:t xml:space="preserve"> torch.cat(all_preds)</w:t>
+      </w:r>
+      <w:r>
+        <w:br/>
+      </w:r>
+      <w:r>
+        <w:rPr>
+          <w:rStyle w:val="NormalTok"/>
+        </w:rPr>
+        <w:t xml:space="preserve">    targs </w:t>
+      </w:r>
+      <w:r>
+        <w:rPr>
+          <w:rStyle w:val="OperatorTok"/>
+        </w:rPr>
+        <w:t xml:space="preserve">=</w:t>
+      </w:r>
+      <w:r>
+        <w:rPr>
+          <w:rStyle w:val="NormalTok"/>
+        </w:rPr>
+        <w:t xml:space="preserve"> torch.cat(all_targets)</w:t>
+      </w:r>
+      <w:r>
+        <w:br/>
+      </w:r>
+      <w:r>
+        <w:rPr>
+          <w:rStyle w:val="NormalTok"/>
+        </w:rPr>
+        <w:t xml:space="preserve">    num_classes </w:t>
+      </w:r>
+      <w:r>
+        <w:rPr>
+          <w:rStyle w:val="OperatorTok"/>
+        </w:rPr>
+        <w:t xml:space="preserve">=</w:t>
+      </w:r>
+      <w:r>
+        <w:rPr>
+          <w:rStyle w:val="NormalTok"/>
+        </w:rPr>
+        <w:t xml:space="preserve"> </w:t>
+      </w:r>
+      <w:r>
+        <w:rPr>
+          <w:rStyle w:val="BuiltInTok"/>
+        </w:rPr>
+        <w:t xml:space="preserve">int</w:t>
+      </w:r>
+      <w:r>
+        <w:rPr>
+          <w:rStyle w:val="NormalTok"/>
+        </w:rPr>
+        <w:t xml:space="preserve">(</w:t>
+      </w:r>
+      <w:r>
+        <w:rPr>
+          <w:rStyle w:val="BuiltInTok"/>
+        </w:rPr>
+        <w:t xml:space="preserve">max</w:t>
+      </w:r>
+      <w:r>
+        <w:rPr>
+          <w:rStyle w:val="NormalTok"/>
+        </w:rPr>
+        <w:t xml:space="preserve">(preds.</w:t>
+      </w:r>
+      <w:r>
+        <w:rPr>
+          <w:rStyle w:val="BuiltInTok"/>
+        </w:rPr>
+        <w:t xml:space="preserve">max</w:t>
+      </w:r>
+      <w:r>
+        <w:rPr>
+          <w:rStyle w:val="NormalTok"/>
+        </w:rPr>
+        <w:t xml:space="preserve">(), targs.</w:t>
+      </w:r>
+      <w:r>
+        <w:rPr>
+          <w:rStyle w:val="BuiltInTok"/>
+        </w:rPr>
+        <w:t xml:space="preserve">max</w:t>
+      </w:r>
+      <w:r>
+        <w:rPr>
+          <w:rStyle w:val="NormalTok"/>
+        </w:rPr>
+        <w:t xml:space="preserve">()).item()) </w:t>
+      </w:r>
+      <w:r>
+        <w:rPr>
+          <w:rStyle w:val="OperatorTok"/>
+        </w:rPr>
+        <w:t xml:space="preserve">+</w:t>
+      </w:r>
+      <w:r>
+        <w:rPr>
+          <w:rStyle w:val="NormalTok"/>
+        </w:rPr>
+        <w:t xml:space="preserve"> </w:t>
+      </w:r>
+      <w:r>
+        <w:rPr>
+          <w:rStyle w:val="DecValTok"/>
+        </w:rPr>
+        <w:t xml:space="preserve">1</w:t>
+      </w:r>
+      <w:r>
+        <w:rPr>
+          <w:rStyle w:val="NormalTok"/>
+        </w:rPr>
+        <w:t xml:space="preserve"> </w:t>
+      </w:r>
+      <w:r>
+        <w:rPr>
+          <w:rStyle w:val="ControlFlowTok"/>
+        </w:rPr>
+        <w:t xml:space="preserve">if</w:t>
+      </w:r>
+      <w:r>
+        <w:rPr>
+          <w:rStyle w:val="NormalTok"/>
+        </w:rPr>
+        <w:t xml:space="preserve"> preds.numel() </w:t>
+      </w:r>
+      <w:r>
+        <w:rPr>
+          <w:rStyle w:val="ControlFlowTok"/>
+        </w:rPr>
+        <w:t xml:space="preserve">else</w:t>
+      </w:r>
+      <w:r>
+        <w:rPr>
+          <w:rStyle w:val="NormalTok"/>
+        </w:rPr>
+        <w:t xml:space="preserve"> </w:t>
+      </w:r>
+      <w:r>
+        <w:rPr>
+          <w:rStyle w:val="DecValTok"/>
+        </w:rPr>
+        <w:t xml:space="preserve">0</w:t>
+      </w:r>
+      <w:r>
+        <w:br/>
+      </w:r>
+      <w:r>
+        <w:rPr>
+          <w:rStyle w:val="NormalTok"/>
+        </w:rPr>
+        <w:t xml:space="preserve">    confusion </w:t>
+      </w:r>
+      <w:r>
+        <w:rPr>
+          <w:rStyle w:val="OperatorTok"/>
+        </w:rPr>
+        <w:t xml:space="preserve">=</w:t>
+      </w:r>
+      <w:r>
+        <w:rPr>
+          <w:rStyle w:val="NormalTok"/>
+        </w:rPr>
+        <w:t xml:space="preserve"> torch.zeros((num_classes, num_classes), dtype</w:t>
+      </w:r>
+      <w:r>
+        <w:rPr>
+          <w:rStyle w:val="OperatorTok"/>
+        </w:rPr>
+        <w:t xml:space="preserve">=</w:t>
+      </w:r>
+      <w:r>
+        <w:rPr>
+          <w:rStyle w:val="NormalTok"/>
+        </w:rPr>
+        <w:t xml:space="preserve">torch.int64)</w:t>
+      </w:r>
+      <w:r>
+        <w:br/>
+      </w:r>
+      <w:r>
+        <w:rPr>
+          <w:rStyle w:val="NormalTok"/>
+        </w:rPr>
+        <w:t xml:space="preserve">    </w:t>
+      </w:r>
+      <w:r>
+        <w:rPr>
+          <w:rStyle w:val="ControlFlowTok"/>
+        </w:rPr>
+        <w:t xml:space="preserve">for</w:t>
+      </w:r>
+      <w:r>
+        <w:rPr>
+          <w:rStyle w:val="NormalTok"/>
+        </w:rPr>
+        <w:t xml:space="preserve"> t, p </w:t>
+      </w:r>
+      <w:r>
+        <w:rPr>
+          <w:rStyle w:val="KeywordTok"/>
+        </w:rPr>
+        <w:t xml:space="preserve">in</w:t>
+      </w:r>
+      <w:r>
+        <w:rPr>
+          <w:rStyle w:val="NormalTok"/>
+        </w:rPr>
+        <w:t xml:space="preserve"> </w:t>
+      </w:r>
+      <w:r>
+        <w:rPr>
+          <w:rStyle w:val="BuiltInTok"/>
+        </w:rPr>
+        <w:t xml:space="preserve">zip</w:t>
+      </w:r>
+      <w:r>
+        <w:rPr>
+          <w:rStyle w:val="NormalTok"/>
+        </w:rPr>
+        <w:t xml:space="preserve">(targs.tolist(), preds.tolist()):</w:t>
+      </w:r>
+      <w:r>
+        <w:br/>
+      </w:r>
+      <w:r>
+        <w:rPr>
+          <w:rStyle w:val="NormalTok"/>
+        </w:rPr>
+        <w:t xml:space="preserve">        confusion[t, p] </w:t>
+      </w:r>
+      <w:r>
+        <w:rPr>
+          <w:rStyle w:val="OperatorTok"/>
+        </w:rPr>
+        <w:t xml:space="preserve">+=</w:t>
+      </w:r>
+      <w:r>
+        <w:rPr>
+          <w:rStyle w:val="NormalTok"/>
+        </w:rPr>
+        <w:t xml:space="preserve"> </w:t>
+      </w:r>
+      <w:r>
+        <w:rPr>
+          <w:rStyle w:val="DecValTok"/>
+        </w:rPr>
+        <w:t xml:space="preserve">1</w:t>
+      </w:r>
+      <w:r>
+        <w:br/>
+      </w:r>
+      <w:r>
+        <w:br/>
+      </w:r>
+      <w:r>
+        <w:rPr>
+          <w:rStyle w:val="NormalTok"/>
+        </w:rPr>
+        <w:t xml:space="preserve">    </w:t>
+      </w:r>
+      <w:r>
+        <w:rPr>
+          <w:rStyle w:val="ControlFlowTok"/>
+        </w:rPr>
+        <w:t xml:space="preserve">return</w:t>
+      </w:r>
+      <w:r>
+        <w:rPr>
+          <w:rStyle w:val="NormalTok"/>
+        </w:rPr>
+        <w:t xml:space="preserve"> {</w:t>
+      </w:r>
+      <w:r>
+        <w:rPr>
+          <w:rStyle w:val="StringTok"/>
+        </w:rPr>
+        <w:t xml:space="preserve">"loss"</w:t>
+      </w:r>
+      <w:r>
+        <w:rPr>
+          <w:rStyle w:val="NormalTok"/>
+        </w:rPr>
+        <w:t xml:space="preserve">: total_loss </w:t>
+      </w:r>
+      <w:r>
+        <w:rPr>
+          <w:rStyle w:val="OperatorTok"/>
+        </w:rPr>
+        <w:t xml:space="preserve">/</w:t>
+      </w:r>
+      <w:r>
+        <w:rPr>
+          <w:rStyle w:val="NormalTok"/>
+        </w:rPr>
+        <w:t xml:space="preserve"> n_batches, </w:t>
+      </w:r>
+      <w:r>
+        <w:rPr>
+          <w:rStyle w:val="StringTok"/>
+        </w:rPr>
+        <w:t xml:space="preserve">"acc"</w:t>
+      </w:r>
+      <w:r>
+        <w:rPr>
+          <w:rStyle w:val="NormalTok"/>
+        </w:rPr>
+        <w:t xml:space="preserve">: total_acc </w:t>
+      </w:r>
+      <w:r>
+        <w:rPr>
+          <w:rStyle w:val="OperatorTok"/>
+        </w:rPr>
+        <w:t xml:space="preserve">/</w:t>
+      </w:r>
+      <w:r>
+        <w:rPr>
+          <w:rStyle w:val="NormalTok"/>
+        </w:rPr>
+        <w:t xml:space="preserve"> n_batches, </w:t>
+      </w:r>
+      <w:r>
+        <w:rPr>
+          <w:rStyle w:val="StringTok"/>
+        </w:rPr>
+        <w:t xml:space="preserve">"confusion"</w:t>
+      </w:r>
+      <w:r>
+        <w:rPr>
+          <w:rStyle w:val="NormalTok"/>
+        </w:rPr>
+        <w:t xml:space="preserve">: confusion}</w:t>
+      </w:r>
+      <w:r>
+        <w:br/>
+      </w:r>
+      <w:r>
+        <w:br/>
+      </w:r>
+      <w:r>
+        <w:br/>
+      </w:r>
+      <w:r>
+        <w:rPr>
+          <w:rStyle w:val="KeywordTok"/>
+        </w:rPr>
+        <w:t xml:space="preserve">def</w:t>
+      </w:r>
+      <w:r>
+        <w:rPr>
+          <w:rStyle w:val="NormalTok"/>
+        </w:rPr>
+        <w:t xml:space="preserve"> build_model(arch: </w:t>
+      </w:r>
+      <w:r>
+        <w:rPr>
+          <w:rStyle w:val="BuiltInTok"/>
+        </w:rPr>
+        <w:t xml:space="preserve">str</w:t>
+      </w:r>
+      <w:r>
+        <w:rPr>
+          <w:rStyle w:val="NormalTok"/>
+        </w:rPr>
+        <w:t xml:space="preserve">, num_classes: </w:t>
+      </w:r>
+      <w:r>
+        <w:rPr>
+          <w:rStyle w:val="BuiltInTok"/>
+        </w:rPr>
+        <w:t xml:space="preserve">int</w:t>
+      </w:r>
+      <w:r>
+        <w:rPr>
+          <w:rStyle w:val="NormalTok"/>
+        </w:rPr>
+        <w:t xml:space="preserve">) </w:t>
+      </w:r>
+      <w:r>
+        <w:rPr>
+          <w:rStyle w:val="OperatorTok"/>
+        </w:rPr>
+        <w:t xml:space="preserve">-&gt;</w:t>
+      </w:r>
+      <w:r>
+        <w:rPr>
+          <w:rStyle w:val="NormalTok"/>
+        </w:rPr>
+        <w:t xml:space="preserve"> nn.Module:</w:t>
+      </w:r>
+      <w:r>
+        <w:br/>
+      </w:r>
+      <w:r>
+        <w:rPr>
+          <w:rStyle w:val="NormalTok"/>
+        </w:rPr>
+        <w:t xml:space="preserve">    arch </w:t>
+      </w:r>
+      <w:r>
+        <w:rPr>
+          <w:rStyle w:val="OperatorTok"/>
+        </w:rPr>
+        <w:t xml:space="preserve">=</w:t>
+      </w:r>
+      <w:r>
+        <w:rPr>
+          <w:rStyle w:val="NormalTok"/>
+        </w:rPr>
+        <w:t xml:space="preserve"> arch.lower().strip()</w:t>
+      </w:r>
+      <w:r>
+        <w:br/>
+      </w:r>
+      <w:r>
+        <w:rPr>
+          <w:rStyle w:val="NormalTok"/>
+        </w:rPr>
+        <w:t xml:space="preserve">    </w:t>
+      </w:r>
+      <w:r>
+        <w:rPr>
+          <w:rStyle w:val="ControlFlowTok"/>
+        </w:rPr>
+        <w:t xml:space="preserve">if</w:t>
+      </w:r>
+      <w:r>
+        <w:rPr>
+          <w:rStyle w:val="NormalTok"/>
+        </w:rPr>
+        <w:t xml:space="preserve"> arch </w:t>
+      </w:r>
+      <w:r>
+        <w:rPr>
+          <w:rStyle w:val="OperatorTok"/>
+        </w:rPr>
+        <w:t xml:space="preserve">==</w:t>
+      </w:r>
+      <w:r>
+        <w:rPr>
+          <w:rStyle w:val="NormalTok"/>
+        </w:rPr>
+        <w:t xml:space="preserve"> </w:t>
+      </w:r>
+      <w:r>
+        <w:rPr>
+          <w:rStyle w:val="StringTok"/>
+        </w:rPr>
+        <w:t xml:space="preserve">"resnet18"</w:t>
+      </w:r>
+      <w:r>
+        <w:rPr>
+          <w:rStyle w:val="NormalTok"/>
+        </w:rPr>
+        <w:t xml:space="preserve">:</w:t>
+      </w:r>
+      <w:r>
+        <w:br/>
+      </w:r>
+      <w:r>
+        <w:rPr>
+          <w:rStyle w:val="NormalTok"/>
+        </w:rPr>
+        <w:t xml:space="preserve">        </w:t>
+      </w:r>
+      <w:r>
+        <w:rPr>
+          <w:rStyle w:val="CommentTok"/>
+        </w:rPr>
+        <w:t xml:space="preserve"># 兼容 torchvision 旧版本（0.8.x）: 使用 pretrained=True</w:t>
+      </w:r>
+      <w:r>
+        <w:br/>
+      </w:r>
+      <w:r>
+        <w:rPr>
+          <w:rStyle w:val="NormalTok"/>
+        </w:rPr>
+        <w:t xml:space="preserve">        </w:t>
+      </w:r>
+      <w:r>
+        <w:rPr>
+          <w:rStyle w:val="ControlFlowTok"/>
+        </w:rPr>
+        <w:t xml:space="preserve">try</w:t>
+      </w:r>
+      <w:r>
+        <w:rPr>
+          <w:rStyle w:val="NormalTok"/>
+        </w:rPr>
+        <w:t xml:space="preserve">:</w:t>
+      </w:r>
+      <w:r>
+        <w:br/>
+      </w:r>
+      <w:r>
+        <w:rPr>
+          <w:rStyle w:val="NormalTok"/>
+        </w:rPr>
+        <w:t xml:space="preserve">            weights </w:t>
+      </w:r>
+      <w:r>
+        <w:rPr>
+          <w:rStyle w:val="OperatorTok"/>
+        </w:rPr>
+        <w:t xml:space="preserve">=</w:t>
+      </w:r>
+      <w:r>
+        <w:rPr>
+          <w:rStyle w:val="NormalTok"/>
+        </w:rPr>
+        <w:t xml:space="preserve"> </w:t>
+      </w:r>
+      <w:r>
+        <w:rPr>
+          <w:rStyle w:val="BuiltInTok"/>
+        </w:rPr>
+        <w:t xml:space="preserve">getattr</w:t>
+      </w:r>
+      <w:r>
+        <w:rPr>
+          <w:rStyle w:val="NormalTok"/>
+        </w:rPr>
+        <w:t xml:space="preserve">(models, </w:t>
+      </w:r>
+      <w:r>
+        <w:rPr>
+          <w:rStyle w:val="StringTok"/>
+        </w:rPr>
+        <w:t xml:space="preserve">"ResNet18_Weights"</w:t>
+      </w:r>
+      <w:r>
+        <w:rPr>
+          <w:rStyle w:val="NormalTok"/>
+        </w:rPr>
+        <w:t xml:space="preserve">).DEFAULT  </w:t>
+      </w:r>
+      <w:r>
+        <w:rPr>
+          <w:rStyle w:val="CommentTok"/>
+        </w:rPr>
+        <w:t xml:space="preserve"># torchvision&gt;=0.13</w:t>
+      </w:r>
+      <w:r>
+        <w:br/>
+      </w:r>
+      <w:r>
+        <w:rPr>
+          <w:rStyle w:val="NormalTok"/>
+        </w:rPr>
+        <w:t xml:space="preserve">            model </w:t>
+      </w:r>
+      <w:r>
+        <w:rPr>
+          <w:rStyle w:val="OperatorTok"/>
+        </w:rPr>
+        <w:t xml:space="preserve">=</w:t>
+      </w:r>
+      <w:r>
+        <w:rPr>
+          <w:rStyle w:val="NormalTok"/>
+        </w:rPr>
+        <w:t xml:space="preserve"> models.resnet18(weights</w:t>
+      </w:r>
+      <w:r>
+        <w:rPr>
+          <w:rStyle w:val="OperatorTok"/>
+        </w:rPr>
+        <w:t xml:space="preserve">=</w:t>
+      </w:r>
+      <w:r>
+        <w:rPr>
+          <w:rStyle w:val="NormalTok"/>
+        </w:rPr>
+        <w:t xml:space="preserve">weights)</w:t>
+      </w:r>
+      <w:r>
+        <w:br/>
+      </w:r>
+      <w:r>
+        <w:rPr>
+          <w:rStyle w:val="NormalTok"/>
+        </w:rPr>
+        <w:t xml:space="preserve">        </w:t>
+      </w:r>
+      <w:r>
+        <w:rPr>
+          <w:rStyle w:val="ControlFlowTok"/>
+        </w:rPr>
+        <w:t xml:space="preserve">except</w:t>
+      </w:r>
+      <w:r>
+        <w:rPr>
+          <w:rStyle w:val="NormalTok"/>
+        </w:rPr>
+        <w:t xml:space="preserve"> </w:t>
+      </w:r>
+      <w:r>
+        <w:rPr>
+          <w:rStyle w:val="PreprocessorTok"/>
+        </w:rPr>
+        <w:t xml:space="preserve">Exception</w:t>
+      </w:r>
+      <w:r>
+        <w:rPr>
+          <w:rStyle w:val="NormalTok"/>
+        </w:rPr>
+        <w:t xml:space="preserve">:</w:t>
+      </w:r>
+      <w:r>
+        <w:br/>
+      </w:r>
+      <w:r>
+        <w:rPr>
+          <w:rStyle w:val="NormalTok"/>
+        </w:rPr>
+        <w:t xml:space="preserve">            model </w:t>
+      </w:r>
+      <w:r>
+        <w:rPr>
+          <w:rStyle w:val="OperatorTok"/>
+        </w:rPr>
+        <w:t xml:space="preserve">=</w:t>
+      </w:r>
+      <w:r>
+        <w:rPr>
+          <w:rStyle w:val="NormalTok"/>
+        </w:rPr>
+        <w:t xml:space="preserve"> models.resnet18(pretrained</w:t>
+      </w:r>
+      <w:r>
+        <w:rPr>
+          <w:rStyle w:val="OperatorTok"/>
+        </w:rPr>
+        <w:t xml:space="preserve">=</w:t>
+      </w:r>
+      <w:r>
+        <w:rPr>
+          <w:rStyle w:val="VariableTok"/>
+        </w:rPr>
+        <w:t xml:space="preserve">True</w:t>
+      </w:r>
+      <w:r>
+        <w:rPr>
+          <w:rStyle w:val="NormalTok"/>
+        </w:rPr>
+        <w:t xml:space="preserve">)</w:t>
+      </w:r>
+      <w:r>
+        <w:br/>
+      </w:r>
+      <w:r>
+        <w:rPr>
+          <w:rStyle w:val="NormalTok"/>
+        </w:rPr>
+        <w:t xml:space="preserve">        model.fc </w:t>
+      </w:r>
+      <w:r>
+        <w:rPr>
+          <w:rStyle w:val="OperatorTok"/>
+        </w:rPr>
+        <w:t xml:space="preserve">=</w:t>
+      </w:r>
+      <w:r>
+        <w:rPr>
+          <w:rStyle w:val="NormalTok"/>
+        </w:rPr>
+        <w:t xml:space="preserve"> nn.Linear(model.fc.in_features, num_classes)</w:t>
+      </w:r>
+      <w:r>
+        <w:br/>
+      </w:r>
+      <w:r>
+        <w:rPr>
+          <w:rStyle w:val="NormalTok"/>
+        </w:rPr>
+        <w:t xml:space="preserve">        </w:t>
+      </w:r>
+      <w:r>
+        <w:rPr>
+          <w:rStyle w:val="ControlFlowTok"/>
+        </w:rPr>
+        <w:t xml:space="preserve">return</w:t>
+      </w:r>
+      <w:r>
+        <w:rPr>
+          <w:rStyle w:val="NormalTok"/>
+        </w:rPr>
+        <w:t xml:space="preserve"> model</w:t>
+      </w:r>
+      <w:r>
+        <w:br/>
+      </w:r>
+      <w:r>
+        <w:rPr>
+          <w:rStyle w:val="NormalTok"/>
+        </w:rPr>
+        <w:t xml:space="preserve">    </w:t>
+      </w:r>
+      <w:r>
+        <w:rPr>
+          <w:rStyle w:val="ControlFlowTok"/>
+        </w:rPr>
+        <w:t xml:space="preserve">if</w:t>
+      </w:r>
+      <w:r>
+        <w:rPr>
+          <w:rStyle w:val="NormalTok"/>
+        </w:rPr>
+        <w:t xml:space="preserve"> arch </w:t>
+      </w:r>
+      <w:r>
+        <w:rPr>
+          <w:rStyle w:val="OperatorTok"/>
+        </w:rPr>
+        <w:t xml:space="preserve">==</w:t>
+      </w:r>
+      <w:r>
+        <w:rPr>
+          <w:rStyle w:val="NormalTok"/>
+        </w:rPr>
+        <w:t xml:space="preserve"> </w:t>
+      </w:r>
+      <w:r>
+        <w:rPr>
+          <w:rStyle w:val="StringTok"/>
+        </w:rPr>
+        <w:t xml:space="preserve">"mobilenet_v3_small"</w:t>
+      </w:r>
+      <w:r>
+        <w:rPr>
+          <w:rStyle w:val="NormalTok"/>
+        </w:rPr>
+        <w:t xml:space="preserve">:</w:t>
+      </w:r>
+      <w:r>
+        <w:br/>
+      </w:r>
+      <w:r>
+        <w:rPr>
+          <w:rStyle w:val="NormalTok"/>
+        </w:rPr>
+        <w:t xml:space="preserve">        </w:t>
+      </w:r>
+      <w:r>
+        <w:rPr>
+          <w:rStyle w:val="ControlFlowTok"/>
+        </w:rPr>
+        <w:t xml:space="preserve">if</w:t>
+      </w:r>
+      <w:r>
+        <w:rPr>
+          <w:rStyle w:val="NormalTok"/>
+        </w:rPr>
+        <w:t xml:space="preserve"> </w:t>
+      </w:r>
+      <w:r>
+        <w:rPr>
+          <w:rStyle w:val="KeywordTok"/>
+        </w:rPr>
+        <w:t xml:space="preserve">not</w:t>
+      </w:r>
+      <w:r>
+        <w:rPr>
+          <w:rStyle w:val="NormalTok"/>
+        </w:rPr>
+        <w:t xml:space="preserve"> </w:t>
+      </w:r>
+      <w:r>
+        <w:rPr>
+          <w:rStyle w:val="BuiltInTok"/>
+        </w:rPr>
+        <w:t xml:space="preserve">hasattr</w:t>
+      </w:r>
+      <w:r>
+        <w:rPr>
+          <w:rStyle w:val="NormalTok"/>
+        </w:rPr>
+        <w:t xml:space="preserve">(models, </w:t>
+      </w:r>
+      <w:r>
+        <w:rPr>
+          <w:rStyle w:val="StringTok"/>
+        </w:rPr>
+        <w:t xml:space="preserve">"mobilenet_v3_small"</w:t>
+      </w:r>
+      <w:r>
+        <w:rPr>
+          <w:rStyle w:val="NormalTok"/>
+        </w:rPr>
+        <w:t xml:space="preserve">):</w:t>
+      </w:r>
+      <w:r>
+        <w:br/>
+      </w:r>
+      <w:r>
+        <w:rPr>
+          <w:rStyle w:val="NormalTok"/>
+        </w:rPr>
+        <w:t xml:space="preserve">            </w:t>
+      </w:r>
+      <w:r>
+        <w:rPr>
+          <w:rStyle w:val="ControlFlowTok"/>
+        </w:rPr>
+        <w:t xml:space="preserve">raise</w:t>
+      </w:r>
+      <w:r>
+        <w:rPr>
+          <w:rStyle w:val="NormalTok"/>
+        </w:rPr>
+        <w:t xml:space="preserve"> </w:t>
+      </w:r>
+      <w:r>
+        <w:rPr>
+          <w:rStyle w:val="PreprocessorTok"/>
+        </w:rPr>
+        <w:t xml:space="preserve">ValueError</w:t>
+      </w:r>
+      <w:r>
+        <w:rPr>
+          <w:rStyle w:val="NormalTok"/>
+        </w:rPr>
+        <w:t xml:space="preserve">(</w:t>
+      </w:r>
+      <w:r>
+        <w:rPr>
+          <w:rStyle w:val="StringTok"/>
+        </w:rPr>
+        <w:t xml:space="preserve">"当前 torchvision 版本不支持 mobilenet_v3_small，请升级 torchvision 或使用 --arch resnet18"</w:t>
+      </w:r>
+      <w:r>
+        <w:rPr>
+          <w:rStyle w:val="NormalTok"/>
+        </w:rPr>
+        <w:t xml:space="preserve">)</w:t>
+      </w:r>
+      <w:r>
+        <w:br/>
+      </w:r>
+      <w:r>
+        <w:rPr>
+          <w:rStyle w:val="NormalTok"/>
+        </w:rPr>
+        <w:t xml:space="preserve">        </w:t>
+      </w:r>
+      <w:r>
+        <w:rPr>
+          <w:rStyle w:val="ControlFlowTok"/>
+        </w:rPr>
+        <w:t xml:space="preserve">try</w:t>
+      </w:r>
+      <w:r>
+        <w:rPr>
+          <w:rStyle w:val="NormalTok"/>
+        </w:rPr>
+        <w:t xml:space="preserve">:</w:t>
+      </w:r>
+      <w:r>
+        <w:br/>
+      </w:r>
+      <w:r>
+        <w:rPr>
+          <w:rStyle w:val="NormalTok"/>
+        </w:rPr>
+        <w:t xml:space="preserve">            weights </w:t>
+      </w:r>
+      <w:r>
+        <w:rPr>
+          <w:rStyle w:val="OperatorTok"/>
+        </w:rPr>
+        <w:t xml:space="preserve">=</w:t>
+      </w:r>
+      <w:r>
+        <w:rPr>
+          <w:rStyle w:val="NormalTok"/>
+        </w:rPr>
+        <w:t xml:space="preserve"> </w:t>
+      </w:r>
+      <w:r>
+        <w:rPr>
+          <w:rStyle w:val="BuiltInTok"/>
+        </w:rPr>
+        <w:t xml:space="preserve">getattr</w:t>
+      </w:r>
+      <w:r>
+        <w:rPr>
+          <w:rStyle w:val="NormalTok"/>
+        </w:rPr>
+        <w:t xml:space="preserve">(models, </w:t>
+      </w:r>
+      <w:r>
+        <w:rPr>
+          <w:rStyle w:val="StringTok"/>
+        </w:rPr>
+        <w:t xml:space="preserve">"MobileNet_V3_Small_Weights"</w:t>
+      </w:r>
+      <w:r>
+        <w:rPr>
+          <w:rStyle w:val="NormalTok"/>
+        </w:rPr>
+        <w:t xml:space="preserve">).DEFAULT</w:t>
+      </w:r>
+      <w:r>
+        <w:br/>
+      </w:r>
+      <w:r>
+        <w:rPr>
+          <w:rStyle w:val="NormalTok"/>
+        </w:rPr>
+        <w:t xml:space="preserve">            model </w:t>
+      </w:r>
+      <w:r>
+        <w:rPr>
+          <w:rStyle w:val="OperatorTok"/>
+        </w:rPr>
+        <w:t xml:space="preserve">=</w:t>
+      </w:r>
+      <w:r>
+        <w:rPr>
+          <w:rStyle w:val="NormalTok"/>
+        </w:rPr>
+        <w:t xml:space="preserve"> models.mobilenet_v3_small(weights</w:t>
+      </w:r>
+      <w:r>
+        <w:rPr>
+          <w:rStyle w:val="OperatorTok"/>
+        </w:rPr>
+        <w:t xml:space="preserve">=</w:t>
+      </w:r>
+      <w:r>
+        <w:rPr>
+          <w:rStyle w:val="NormalTok"/>
+        </w:rPr>
+        <w:t xml:space="preserve">weights)</w:t>
+      </w:r>
+      <w:r>
+        <w:br/>
+      </w:r>
+      <w:r>
+        <w:rPr>
+          <w:rStyle w:val="NormalTok"/>
+        </w:rPr>
+        <w:t xml:space="preserve">        </w:t>
+      </w:r>
+      <w:r>
+        <w:rPr>
+          <w:rStyle w:val="ControlFlowTok"/>
+        </w:rPr>
+        <w:t xml:space="preserve">except</w:t>
+      </w:r>
+      <w:r>
+        <w:rPr>
+          <w:rStyle w:val="NormalTok"/>
+        </w:rPr>
+        <w:t xml:space="preserve"> </w:t>
+      </w:r>
+      <w:r>
+        <w:rPr>
+          <w:rStyle w:val="PreprocessorTok"/>
+        </w:rPr>
+        <w:t xml:space="preserve">Exception</w:t>
+      </w:r>
+      <w:r>
+        <w:rPr>
+          <w:rStyle w:val="NormalTok"/>
+        </w:rPr>
+        <w:t xml:space="preserve">:</w:t>
+      </w:r>
+      <w:r>
+        <w:br/>
+      </w:r>
+      <w:r>
+        <w:rPr>
+          <w:rStyle w:val="NormalTok"/>
+        </w:rPr>
+        <w:t xml:space="preserve">            model </w:t>
+      </w:r>
+      <w:r>
+        <w:rPr>
+          <w:rStyle w:val="OperatorTok"/>
+        </w:rPr>
+        <w:t xml:space="preserve">=</w:t>
+      </w:r>
+      <w:r>
+        <w:rPr>
+          <w:rStyle w:val="NormalTok"/>
+        </w:rPr>
+        <w:t xml:space="preserve"> models.mobilenet_v3_small(pretrained</w:t>
+      </w:r>
+      <w:r>
+        <w:rPr>
+          <w:rStyle w:val="OperatorTok"/>
+        </w:rPr>
+        <w:t xml:space="preserve">=</w:t>
+      </w:r>
+      <w:r>
+        <w:rPr>
+          <w:rStyle w:val="VariableTok"/>
+        </w:rPr>
+        <w:t xml:space="preserve">True</w:t>
+      </w:r>
+      <w:r>
+        <w:rPr>
+          <w:rStyle w:val="NormalTok"/>
+        </w:rPr>
+        <w:t xml:space="preserve">)</w:t>
+      </w:r>
+      <w:r>
+        <w:br/>
+      </w:r>
+      <w:r>
+        <w:rPr>
+          <w:rStyle w:val="NormalTok"/>
+        </w:rPr>
+        <w:t xml:space="preserve">        model.classifier[</w:t>
+      </w:r>
+      <w:r>
+        <w:rPr>
+          <w:rStyle w:val="OperatorTok"/>
+        </w:rPr>
+        <w:t xml:space="preserve">-</w:t>
+      </w:r>
+      <w:r>
+        <w:rPr>
+          <w:rStyle w:val="DecValTok"/>
+        </w:rPr>
+        <w:t xml:space="preserve">1</w:t>
+      </w:r>
+      <w:r>
+        <w:rPr>
+          <w:rStyle w:val="NormalTok"/>
+        </w:rPr>
+        <w:t xml:space="preserve">] </w:t>
+      </w:r>
+      <w:r>
+        <w:rPr>
+          <w:rStyle w:val="OperatorTok"/>
+        </w:rPr>
+        <w:t xml:space="preserve">=</w:t>
+      </w:r>
+      <w:r>
+        <w:rPr>
+          <w:rStyle w:val="NormalTok"/>
+        </w:rPr>
+        <w:t xml:space="preserve"> nn.Linear(model.classifier[</w:t>
+      </w:r>
+      <w:r>
+        <w:rPr>
+          <w:rStyle w:val="OperatorTok"/>
+        </w:rPr>
+        <w:t xml:space="preserve">-</w:t>
+      </w:r>
+      <w:r>
+        <w:rPr>
+          <w:rStyle w:val="DecValTok"/>
+        </w:rPr>
+        <w:t xml:space="preserve">1</w:t>
+      </w:r>
+      <w:r>
+        <w:rPr>
+          <w:rStyle w:val="NormalTok"/>
+        </w:rPr>
+        <w:t xml:space="preserve">].in_features, num_classes)</w:t>
+      </w:r>
+      <w:r>
+        <w:br/>
+      </w:r>
+      <w:r>
+        <w:rPr>
+          <w:rStyle w:val="NormalTok"/>
+        </w:rPr>
+        <w:t xml:space="preserve">        </w:t>
+      </w:r>
+      <w:r>
+        <w:rPr>
+          <w:rStyle w:val="ControlFlowTok"/>
+        </w:rPr>
+        <w:t xml:space="preserve">return</w:t>
+      </w:r>
+      <w:r>
+        <w:rPr>
+          <w:rStyle w:val="NormalTok"/>
+        </w:rPr>
+        <w:t xml:space="preserve"> model</w:t>
+      </w:r>
+      <w:r>
+        <w:br/>
+      </w:r>
+      <w:r>
+        <w:rPr>
+          <w:rStyle w:val="NormalTok"/>
+        </w:rPr>
+        <w:t xml:space="preserve">    </w:t>
+      </w:r>
+      <w:r>
+        <w:rPr>
+          <w:rStyle w:val="ControlFlowTok"/>
+        </w:rPr>
+        <w:t xml:space="preserve">if</w:t>
+      </w:r>
+      <w:r>
+        <w:rPr>
+          <w:rStyle w:val="NormalTok"/>
+        </w:rPr>
+        <w:t xml:space="preserve"> arch </w:t>
+      </w:r>
+      <w:r>
+        <w:rPr>
+          <w:rStyle w:val="OperatorTok"/>
+        </w:rPr>
+        <w:t xml:space="preserve">==</w:t>
+      </w:r>
+      <w:r>
+        <w:rPr>
+          <w:rStyle w:val="NormalTok"/>
+        </w:rPr>
+        <w:t xml:space="preserve"> </w:t>
+      </w:r>
+      <w:r>
+        <w:rPr>
+          <w:rStyle w:val="StringTok"/>
+        </w:rPr>
+        <w:t xml:space="preserve">"efficientnet_b0"</w:t>
+      </w:r>
+      <w:r>
+        <w:rPr>
+          <w:rStyle w:val="NormalTok"/>
+        </w:rPr>
+        <w:t xml:space="preserve">:</w:t>
+      </w:r>
+      <w:r>
+        <w:br/>
+      </w:r>
+      <w:r>
+        <w:rPr>
+          <w:rStyle w:val="NormalTok"/>
+        </w:rPr>
+        <w:t xml:space="preserve">        </w:t>
+      </w:r>
+      <w:r>
+        <w:rPr>
+          <w:rStyle w:val="ControlFlowTok"/>
+        </w:rPr>
+        <w:t xml:space="preserve">if</w:t>
+      </w:r>
+      <w:r>
+        <w:rPr>
+          <w:rStyle w:val="NormalTok"/>
+        </w:rPr>
+        <w:t xml:space="preserve"> </w:t>
+      </w:r>
+      <w:r>
+        <w:rPr>
+          <w:rStyle w:val="KeywordTok"/>
+        </w:rPr>
+        <w:t xml:space="preserve">not</w:t>
+      </w:r>
+      <w:r>
+        <w:rPr>
+          <w:rStyle w:val="NormalTok"/>
+        </w:rPr>
+        <w:t xml:space="preserve"> </w:t>
+      </w:r>
+      <w:r>
+        <w:rPr>
+          <w:rStyle w:val="BuiltInTok"/>
+        </w:rPr>
+        <w:t xml:space="preserve">hasattr</w:t>
+      </w:r>
+      <w:r>
+        <w:rPr>
+          <w:rStyle w:val="NormalTok"/>
+        </w:rPr>
+        <w:t xml:space="preserve">(models, </w:t>
+      </w:r>
+      <w:r>
+        <w:rPr>
+          <w:rStyle w:val="StringTok"/>
+        </w:rPr>
+        <w:t xml:space="preserve">"efficientnet_b0"</w:t>
+      </w:r>
+      <w:r>
+        <w:rPr>
+          <w:rStyle w:val="NormalTok"/>
+        </w:rPr>
+        <w:t xml:space="preserve">):</w:t>
+      </w:r>
+      <w:r>
+        <w:br/>
+      </w:r>
+      <w:r>
+        <w:rPr>
+          <w:rStyle w:val="NormalTok"/>
+        </w:rPr>
+        <w:t xml:space="preserve">            </w:t>
+      </w:r>
+      <w:r>
+        <w:rPr>
+          <w:rStyle w:val="ControlFlowTok"/>
+        </w:rPr>
+        <w:t xml:space="preserve">raise</w:t>
+      </w:r>
+      <w:r>
+        <w:rPr>
+          <w:rStyle w:val="NormalTok"/>
+        </w:rPr>
+        <w:t xml:space="preserve"> </w:t>
+      </w:r>
+      <w:r>
+        <w:rPr>
+          <w:rStyle w:val="PreprocessorTok"/>
+        </w:rPr>
+        <w:t xml:space="preserve">ValueError</w:t>
+      </w:r>
+      <w:r>
+        <w:rPr>
+          <w:rStyle w:val="NormalTok"/>
+        </w:rPr>
+        <w:t xml:space="preserve">(</w:t>
+      </w:r>
+      <w:r>
+        <w:rPr>
+          <w:rStyle w:val="StringTok"/>
+        </w:rPr>
+        <w:t xml:space="preserve">"当前 torchvision 版本不支持 efficientnet_b0，请升级 torchvision 或使用 --arch resnet18"</w:t>
+      </w:r>
+      <w:r>
+        <w:rPr>
+          <w:rStyle w:val="NormalTok"/>
+        </w:rPr>
+        <w:t xml:space="preserve">)</w:t>
+      </w:r>
+      <w:r>
+        <w:br/>
+      </w:r>
+      <w:r>
+        <w:rPr>
+          <w:rStyle w:val="NormalTok"/>
+        </w:rPr>
+        <w:t xml:space="preserve">        </w:t>
+      </w:r>
+      <w:r>
+        <w:rPr>
+          <w:rStyle w:val="ControlFlowTok"/>
+        </w:rPr>
+        <w:t xml:space="preserve">try</w:t>
+      </w:r>
+      <w:r>
+        <w:rPr>
+          <w:rStyle w:val="NormalTok"/>
+        </w:rPr>
+        <w:t xml:space="preserve">:</w:t>
+      </w:r>
+      <w:r>
+        <w:br/>
+      </w:r>
+      <w:r>
+        <w:rPr>
+          <w:rStyle w:val="NormalTok"/>
+        </w:rPr>
+        <w:t xml:space="preserve">            weights </w:t>
+      </w:r>
+      <w:r>
+        <w:rPr>
+          <w:rStyle w:val="OperatorTok"/>
+        </w:rPr>
+        <w:t xml:space="preserve">=</w:t>
+      </w:r>
+      <w:r>
+        <w:rPr>
+          <w:rStyle w:val="NormalTok"/>
+        </w:rPr>
+        <w:t xml:space="preserve"> </w:t>
+      </w:r>
+      <w:r>
+        <w:rPr>
+          <w:rStyle w:val="BuiltInTok"/>
+        </w:rPr>
+        <w:t xml:space="preserve">getattr</w:t>
+      </w:r>
+      <w:r>
+        <w:rPr>
+          <w:rStyle w:val="NormalTok"/>
+        </w:rPr>
+        <w:t xml:space="preserve">(models, </w:t>
+      </w:r>
+      <w:r>
+        <w:rPr>
+          <w:rStyle w:val="StringTok"/>
+        </w:rPr>
+        <w:t xml:space="preserve">"EfficientNet_B0_Weights"</w:t>
+      </w:r>
+      <w:r>
+        <w:rPr>
+          <w:rStyle w:val="NormalTok"/>
+        </w:rPr>
+        <w:t xml:space="preserve">).DEFAULT</w:t>
+      </w:r>
+      <w:r>
+        <w:br/>
+      </w:r>
+      <w:r>
+        <w:rPr>
+          <w:rStyle w:val="NormalTok"/>
+        </w:rPr>
+        <w:t xml:space="preserve">            model </w:t>
+      </w:r>
+      <w:r>
+        <w:rPr>
+          <w:rStyle w:val="OperatorTok"/>
+        </w:rPr>
+        <w:t xml:space="preserve">=</w:t>
+      </w:r>
+      <w:r>
+        <w:rPr>
+          <w:rStyle w:val="NormalTok"/>
+        </w:rPr>
+        <w:t xml:space="preserve"> models.efficientnet_b0(weights</w:t>
+      </w:r>
+      <w:r>
+        <w:rPr>
+          <w:rStyle w:val="OperatorTok"/>
+        </w:rPr>
+        <w:t xml:space="preserve">=</w:t>
+      </w:r>
+      <w:r>
+        <w:rPr>
+          <w:rStyle w:val="NormalTok"/>
+        </w:rPr>
+        <w:t xml:space="preserve">weights)</w:t>
+      </w:r>
+      <w:r>
+        <w:br/>
+      </w:r>
+      <w:r>
+        <w:rPr>
+          <w:rStyle w:val="NormalTok"/>
+        </w:rPr>
+        <w:t xml:space="preserve">        </w:t>
+      </w:r>
+      <w:r>
+        <w:rPr>
+          <w:rStyle w:val="ControlFlowTok"/>
+        </w:rPr>
+        <w:t xml:space="preserve">except</w:t>
+      </w:r>
+      <w:r>
+        <w:rPr>
+          <w:rStyle w:val="NormalTok"/>
+        </w:rPr>
+        <w:t xml:space="preserve"> </w:t>
+      </w:r>
+      <w:r>
+        <w:rPr>
+          <w:rStyle w:val="PreprocessorTok"/>
+        </w:rPr>
+        <w:t xml:space="preserve">Exception</w:t>
+      </w:r>
+      <w:r>
+        <w:rPr>
+          <w:rStyle w:val="NormalTok"/>
+        </w:rPr>
+        <w:t xml:space="preserve">:</w:t>
+      </w:r>
+      <w:r>
+        <w:br/>
+      </w:r>
+      <w:r>
+        <w:rPr>
+          <w:rStyle w:val="NormalTok"/>
+        </w:rPr>
+        <w:t xml:space="preserve">            model </w:t>
+      </w:r>
+      <w:r>
+        <w:rPr>
+          <w:rStyle w:val="OperatorTok"/>
+        </w:rPr>
+        <w:t xml:space="preserve">=</w:t>
+      </w:r>
+      <w:r>
+        <w:rPr>
+          <w:rStyle w:val="NormalTok"/>
+        </w:rPr>
+        <w:t xml:space="preserve"> models.efficientnet_b0(pretrained</w:t>
+      </w:r>
+      <w:r>
+        <w:rPr>
+          <w:rStyle w:val="OperatorTok"/>
+        </w:rPr>
+        <w:t xml:space="preserve">=</w:t>
+      </w:r>
+      <w:r>
+        <w:rPr>
+          <w:rStyle w:val="VariableTok"/>
+        </w:rPr>
+        <w:t xml:space="preserve">True</w:t>
+      </w:r>
+      <w:r>
+        <w:rPr>
+          <w:rStyle w:val="NormalTok"/>
+        </w:rPr>
+        <w:t xml:space="preserve">)</w:t>
+      </w:r>
+      <w:r>
+        <w:br/>
+      </w:r>
+      <w:r>
+        <w:rPr>
+          <w:rStyle w:val="NormalTok"/>
+        </w:rPr>
+        <w:t xml:space="preserve">        model.classifier[</w:t>
+      </w:r>
+      <w:r>
+        <w:rPr>
+          <w:rStyle w:val="OperatorTok"/>
+        </w:rPr>
+        <w:t xml:space="preserve">-</w:t>
+      </w:r>
+      <w:r>
+        <w:rPr>
+          <w:rStyle w:val="DecValTok"/>
+        </w:rPr>
+        <w:t xml:space="preserve">1</w:t>
+      </w:r>
+      <w:r>
+        <w:rPr>
+          <w:rStyle w:val="NormalTok"/>
+        </w:rPr>
+        <w:t xml:space="preserve">] </w:t>
+      </w:r>
+      <w:r>
+        <w:rPr>
+          <w:rStyle w:val="OperatorTok"/>
+        </w:rPr>
+        <w:t xml:space="preserve">=</w:t>
+      </w:r>
+      <w:r>
+        <w:rPr>
+          <w:rStyle w:val="NormalTok"/>
+        </w:rPr>
+        <w:t xml:space="preserve"> nn.Linear(model.classifier[</w:t>
+      </w:r>
+      <w:r>
+        <w:rPr>
+          <w:rStyle w:val="OperatorTok"/>
+        </w:rPr>
+        <w:t xml:space="preserve">-</w:t>
+      </w:r>
+      <w:r>
+        <w:rPr>
+          <w:rStyle w:val="DecValTok"/>
+        </w:rPr>
+        <w:t xml:space="preserve">1</w:t>
+      </w:r>
+      <w:r>
+        <w:rPr>
+          <w:rStyle w:val="NormalTok"/>
+        </w:rPr>
+        <w:t xml:space="preserve">].in_features, num_classes)</w:t>
+      </w:r>
+      <w:r>
+        <w:br/>
+      </w:r>
+      <w:r>
+        <w:rPr>
+          <w:rStyle w:val="NormalTok"/>
+        </w:rPr>
+        <w:t xml:space="preserve">        </w:t>
+      </w:r>
+      <w:r>
+        <w:rPr>
+          <w:rStyle w:val="ControlFlowTok"/>
+        </w:rPr>
+        <w:t xml:space="preserve">return</w:t>
+      </w:r>
+      <w:r>
+        <w:rPr>
+          <w:rStyle w:val="NormalTok"/>
+        </w:rPr>
+        <w:t xml:space="preserve"> model</w:t>
+      </w:r>
+      <w:r>
+        <w:br/>
+      </w:r>
+      <w:r>
+        <w:rPr>
+          <w:rStyle w:val="NormalTok"/>
+        </w:rPr>
+        <w:t xml:space="preserve">    </w:t>
+      </w:r>
+      <w:r>
+        <w:rPr>
+          <w:rStyle w:val="ControlFlowTok"/>
+        </w:rPr>
+        <w:t xml:space="preserve">raise</w:t>
+      </w:r>
+      <w:r>
+        <w:rPr>
+          <w:rStyle w:val="NormalTok"/>
+        </w:rPr>
+        <w:t xml:space="preserve"> </w:t>
+      </w:r>
+      <w:r>
+        <w:rPr>
+          <w:rStyle w:val="PreprocessorTok"/>
+        </w:rPr>
+        <w:t xml:space="preserve">ValueError</w:t>
+      </w:r>
+      <w:r>
+        <w:rPr>
+          <w:rStyle w:val="NormalTok"/>
+        </w:rPr>
+        <w:t xml:space="preserve">(</w:t>
+      </w:r>
+      <w:r>
+        <w:rPr>
+          <w:rStyle w:val="SpecialStringTok"/>
+        </w:rPr>
+        <w:t xml:space="preserve">f"不支持的 arch: </w:t>
+      </w:r>
+      <w:r>
+        <w:rPr>
+          <w:rStyle w:val="SpecialCharTok"/>
+        </w:rPr>
+        <w:t xml:space="preserve">{</w:t>
+      </w:r>
+      <w:r>
+        <w:rPr>
+          <w:rStyle w:val="NormalTok"/>
+        </w:rPr>
+        <w:t xml:space="preserve">arch</w:t>
+      </w:r>
+      <w:r>
+        <w:rPr>
+          <w:rStyle w:val="SpecialCharTok"/>
+        </w:rPr>
+        <w:t xml:space="preserve">}</w:t>
+      </w:r>
+      <w:r>
+        <w:rPr>
+          <w:rStyle w:val="SpecialStringTok"/>
+        </w:rPr>
+        <w:t xml:space="preserve">（可选: resnet18 / mobilenet_v3_small / efficientnet_b0）"</w:t>
+      </w:r>
+      <w:r>
+        <w:rPr>
+          <w:rStyle w:val="NormalTok"/>
+        </w:rPr>
+        <w:t xml:space="preserve">)</w:t>
+      </w:r>
+      <w:r>
+        <w:br/>
+      </w:r>
+      <w:r>
+        <w:br/>
+      </w:r>
+      <w:r>
+        <w:br/>
+      </w:r>
+      <w:r>
+        <w:rPr>
+          <w:rStyle w:val="KeywordTok"/>
+        </w:rPr>
+        <w:t xml:space="preserve">def</w:t>
+      </w:r>
+      <w:r>
+        <w:rPr>
+          <w:rStyle w:val="NormalTok"/>
+        </w:rPr>
+        <w:t xml:space="preserve"> build_transforms(img_size: </w:t>
+      </w:r>
+      <w:r>
+        <w:rPr>
+          <w:rStyle w:val="BuiltInTok"/>
+        </w:rPr>
+        <w:t xml:space="preserve">int</w:t>
+      </w:r>
+      <w:r>
+        <w:rPr>
+          <w:rStyle w:val="NormalTok"/>
+        </w:rPr>
+        <w:t xml:space="preserve">) </w:t>
+      </w:r>
+      <w:r>
+        <w:rPr>
+          <w:rStyle w:val="OperatorTok"/>
+        </w:rPr>
+        <w:t xml:space="preserve">-&gt;</w:t>
+      </w:r>
+      <w:r>
+        <w:rPr>
+          <w:rStyle w:val="NormalTok"/>
+        </w:rPr>
+        <w:t xml:space="preserve"> Tuple[transforms.Compose, transforms.Compose]:</w:t>
+      </w:r>
+      <w:r>
+        <w:br/>
+      </w:r>
+      <w:r>
+        <w:rPr>
+          <w:rStyle w:val="NormalTok"/>
+        </w:rPr>
+        <w:t xml:space="preserve">    train_tf </w:t>
+      </w:r>
+      <w:r>
+        <w:rPr>
+          <w:rStyle w:val="OperatorTok"/>
+        </w:rPr>
+        <w:t xml:space="preserve">=</w:t>
+      </w:r>
+      <w:r>
+        <w:rPr>
+          <w:rStyle w:val="NormalTok"/>
+        </w:rPr>
+        <w:t xml:space="preserve"> transforms.Compose(</w:t>
+      </w:r>
+      <w:r>
+        <w:br/>
+      </w:r>
+      <w:r>
+        <w:rPr>
+          <w:rStyle w:val="NormalTok"/>
+        </w:rPr>
+        <w:t xml:space="preserve">        [</w:t>
+      </w:r>
+      <w:r>
+        <w:br/>
+      </w:r>
+      <w:r>
+        <w:rPr>
+          <w:rStyle w:val="NormalTok"/>
+        </w:rPr>
+        <w:t xml:space="preserve">            transforms.RandomResizedCrop(img_size, scale</w:t>
+      </w:r>
+      <w:r>
+        <w:rPr>
+          <w:rStyle w:val="OperatorTok"/>
+        </w:rPr>
+        <w:t xml:space="preserve">=</w:t>
+      </w:r>
+      <w:r>
+        <w:rPr>
+          <w:rStyle w:val="NormalTok"/>
+        </w:rPr>
+        <w:t xml:space="preserve">(</w:t>
+      </w:r>
+      <w:r>
+        <w:rPr>
+          <w:rStyle w:val="FloatTok"/>
+        </w:rPr>
+        <w:t xml:space="preserve">0.7</w:t>
+      </w:r>
+      <w:r>
+        <w:rPr>
+          <w:rStyle w:val="NormalTok"/>
+        </w:rPr>
+        <w:t xml:space="preserve">, </w:t>
+      </w:r>
+      <w:r>
+        <w:rPr>
+          <w:rStyle w:val="FloatTok"/>
+        </w:rPr>
+        <w:t xml:space="preserve">1.0</w:t>
+      </w:r>
+      <w:r>
+        <w:rPr>
+          <w:rStyle w:val="NormalTok"/>
+        </w:rPr>
+        <w:t xml:space="preserve">)),</w:t>
+      </w:r>
+      <w:r>
+        <w:br/>
+      </w:r>
+      <w:r>
+        <w:rPr>
+          <w:rStyle w:val="NormalTok"/>
+        </w:rPr>
+        <w:t xml:space="preserve">            transforms.RandomHorizontalFlip(p</w:t>
+      </w:r>
+      <w:r>
+        <w:rPr>
+          <w:rStyle w:val="OperatorTok"/>
+        </w:rPr>
+        <w:t xml:space="preserve">=</w:t>
+      </w:r>
+      <w:r>
+        <w:rPr>
+          <w:rStyle w:val="FloatTok"/>
+        </w:rPr>
+        <w:t xml:space="preserve">0.5</w:t>
+      </w:r>
+      <w:r>
+        <w:rPr>
+          <w:rStyle w:val="NormalTok"/>
+        </w:rPr>
+        <w:t xml:space="preserve">),</w:t>
+      </w:r>
+      <w:r>
+        <w:br/>
+      </w:r>
+      <w:r>
+        <w:rPr>
+          <w:rStyle w:val="NormalTok"/>
+        </w:rPr>
+        <w:t xml:space="preserve">            transforms.ColorJitter(brightness</w:t>
+      </w:r>
+      <w:r>
+        <w:rPr>
+          <w:rStyle w:val="OperatorTok"/>
+        </w:rPr>
+        <w:t xml:space="preserve">=</w:t>
+      </w:r>
+      <w:r>
+        <w:rPr>
+          <w:rStyle w:val="FloatTok"/>
+        </w:rPr>
+        <w:t xml:space="preserve">0.2</w:t>
+      </w:r>
+      <w:r>
+        <w:rPr>
+          <w:rStyle w:val="NormalTok"/>
+        </w:rPr>
+        <w:t xml:space="preserve">, contrast</w:t>
+      </w:r>
+      <w:r>
+        <w:rPr>
+          <w:rStyle w:val="OperatorTok"/>
+        </w:rPr>
+        <w:t xml:space="preserve">=</w:t>
+      </w:r>
+      <w:r>
+        <w:rPr>
+          <w:rStyle w:val="FloatTok"/>
+        </w:rPr>
+        <w:t xml:space="preserve">0.2</w:t>
+      </w:r>
+      <w:r>
+        <w:rPr>
+          <w:rStyle w:val="NormalTok"/>
+        </w:rPr>
+        <w:t xml:space="preserve">, saturation</w:t>
+      </w:r>
+      <w:r>
+        <w:rPr>
+          <w:rStyle w:val="OperatorTok"/>
+        </w:rPr>
+        <w:t xml:space="preserve">=</w:t>
+      </w:r>
+      <w:r>
+        <w:rPr>
+          <w:rStyle w:val="FloatTok"/>
+        </w:rPr>
+        <w:t xml:space="preserve">0.2</w:t>
+      </w:r>
+      <w:r>
+        <w:rPr>
+          <w:rStyle w:val="NormalTok"/>
+        </w:rPr>
+        <w:t xml:space="preserve">, hue</w:t>
+      </w:r>
+      <w:r>
+        <w:rPr>
+          <w:rStyle w:val="OperatorTok"/>
+        </w:rPr>
+        <w:t xml:space="preserve">=</w:t>
+      </w:r>
+      <w:r>
+        <w:rPr>
+          <w:rStyle w:val="FloatTok"/>
+        </w:rPr>
+        <w:t xml:space="preserve">0.05</w:t>
+      </w:r>
+      <w:r>
+        <w:rPr>
+          <w:rStyle w:val="NormalTok"/>
+        </w:rPr>
+        <w:t xml:space="preserve">),</w:t>
+      </w:r>
+      <w:r>
+        <w:br/>
+      </w:r>
+      <w:r>
+        <w:rPr>
+          <w:rStyle w:val="NormalTok"/>
+        </w:rPr>
+        <w:t xml:space="preserve">            transforms.ToTensor(),</w:t>
+      </w:r>
+      <w:r>
+        <w:br/>
+      </w:r>
+      <w:r>
+        <w:rPr>
+          <w:rStyle w:val="NormalTok"/>
+        </w:rPr>
+        <w:t xml:space="preserve">            transforms.Normalize(mean</w:t>
+      </w:r>
+      <w:r>
+        <w:rPr>
+          <w:rStyle w:val="OperatorTok"/>
+        </w:rPr>
+        <w:t xml:space="preserve">=</w:t>
+      </w:r>
+      <w:r>
+        <w:rPr>
+          <w:rStyle w:val="NormalTok"/>
+        </w:rPr>
+        <w:t xml:space="preserve">(</w:t>
+      </w:r>
+      <w:r>
+        <w:rPr>
+          <w:rStyle w:val="FloatTok"/>
+        </w:rPr>
+        <w:t xml:space="preserve">0.485</w:t>
+      </w:r>
+      <w:r>
+        <w:rPr>
+          <w:rStyle w:val="NormalTok"/>
+        </w:rPr>
+        <w:t xml:space="preserve">, </w:t>
+      </w:r>
+      <w:r>
+        <w:rPr>
+          <w:rStyle w:val="FloatTok"/>
+        </w:rPr>
+        <w:t xml:space="preserve">0.456</w:t>
+      </w:r>
+      <w:r>
+        <w:rPr>
+          <w:rStyle w:val="NormalTok"/>
+        </w:rPr>
+        <w:t xml:space="preserve">, </w:t>
+      </w:r>
+      <w:r>
+        <w:rPr>
+          <w:rStyle w:val="FloatTok"/>
+        </w:rPr>
+        <w:t xml:space="preserve">0.406</w:t>
+      </w:r>
+      <w:r>
+        <w:rPr>
+          <w:rStyle w:val="NormalTok"/>
+        </w:rPr>
+        <w:t xml:space="preserve">), std</w:t>
+      </w:r>
+      <w:r>
+        <w:rPr>
+          <w:rStyle w:val="OperatorTok"/>
+        </w:rPr>
+        <w:t xml:space="preserve">=</w:t>
+      </w:r>
+      <w:r>
+        <w:rPr>
+          <w:rStyle w:val="NormalTok"/>
+        </w:rPr>
+        <w:t xml:space="preserve">(</w:t>
+      </w:r>
+      <w:r>
+        <w:rPr>
+          <w:rStyle w:val="FloatTok"/>
+        </w:rPr>
+        <w:t xml:space="preserve">0.229</w:t>
+      </w:r>
+      <w:r>
+        <w:rPr>
+          <w:rStyle w:val="NormalTok"/>
+        </w:rPr>
+        <w:t xml:space="preserve">, </w:t>
+      </w:r>
+      <w:r>
+        <w:rPr>
+          <w:rStyle w:val="FloatTok"/>
+        </w:rPr>
+        <w:t xml:space="preserve">0.224</w:t>
+      </w:r>
+      <w:r>
+        <w:rPr>
+          <w:rStyle w:val="NormalTok"/>
+        </w:rPr>
+        <w:t xml:space="preserve">, </w:t>
+      </w:r>
+      <w:r>
+        <w:rPr>
+          <w:rStyle w:val="FloatTok"/>
+        </w:rPr>
+        <w:t xml:space="preserve">0.225</w:t>
+      </w:r>
+      <w:r>
+        <w:rPr>
+          <w:rStyle w:val="NormalTok"/>
+        </w:rPr>
+        <w:t xml:space="preserve">)),</w:t>
+      </w:r>
+      <w:r>
+        <w:br/>
+      </w:r>
+      <w:r>
+        <w:rPr>
+          <w:rStyle w:val="NormalTok"/>
+        </w:rPr>
+        <w:t xml:space="preserve">        ]</w:t>
+      </w:r>
+      <w:r>
+        <w:br/>
+      </w:r>
+      <w:r>
+        <w:rPr>
+          <w:rStyle w:val="NormalTok"/>
+        </w:rPr>
+        <w:t xml:space="preserve">    )</w:t>
+      </w:r>
+      <w:r>
+        <w:br/>
+      </w:r>
+      <w:r>
+        <w:rPr>
+          <w:rStyle w:val="NormalTok"/>
+        </w:rPr>
+        <w:t xml:space="preserve">    val_tf </w:t>
+      </w:r>
+      <w:r>
+        <w:rPr>
+          <w:rStyle w:val="OperatorTok"/>
+        </w:rPr>
+        <w:t xml:space="preserve">=</w:t>
+      </w:r>
+      <w:r>
+        <w:rPr>
+          <w:rStyle w:val="NormalTok"/>
+        </w:rPr>
+        <w:t xml:space="preserve"> transforms.Compose(</w:t>
+      </w:r>
+      <w:r>
+        <w:br/>
+      </w:r>
+      <w:r>
+        <w:rPr>
+          <w:rStyle w:val="NormalTok"/>
+        </w:rPr>
+        <w:t xml:space="preserve">        [</w:t>
+      </w:r>
+      <w:r>
+        <w:br/>
+      </w:r>
+      <w:r>
+        <w:rPr>
+          <w:rStyle w:val="NormalTok"/>
+        </w:rPr>
+        <w:t xml:space="preserve">            transforms.Resize(</w:t>
+      </w:r>
+      <w:r>
+        <w:rPr>
+          <w:rStyle w:val="BuiltInTok"/>
+        </w:rPr>
+        <w:t xml:space="preserve">int</w:t>
+      </w:r>
+      <w:r>
+        <w:rPr>
+          <w:rStyle w:val="NormalTok"/>
+        </w:rPr>
+        <w:t xml:space="preserve">(img_size </w:t>
+      </w:r>
+      <w:r>
+        <w:rPr>
+          <w:rStyle w:val="OperatorTok"/>
+        </w:rPr>
+        <w:t xml:space="preserve">*</w:t>
+      </w:r>
+      <w:r>
+        <w:rPr>
+          <w:rStyle w:val="NormalTok"/>
+        </w:rPr>
+        <w:t xml:space="preserve"> </w:t>
+      </w:r>
+      <w:r>
+        <w:rPr>
+          <w:rStyle w:val="FloatTok"/>
+        </w:rPr>
+        <w:t xml:space="preserve">1.15</w:t>
+      </w:r>
+      <w:r>
+        <w:rPr>
+          <w:rStyle w:val="NormalTok"/>
+        </w:rPr>
+        <w:t xml:space="preserve">)),</w:t>
+      </w:r>
+      <w:r>
+        <w:br/>
+      </w:r>
+      <w:r>
+        <w:rPr>
+          <w:rStyle w:val="NormalTok"/>
+        </w:rPr>
+        <w:t xml:space="preserve">            transforms.CenterCrop(img_size),</w:t>
+      </w:r>
+      <w:r>
+        <w:br/>
+      </w:r>
+      <w:r>
+        <w:rPr>
+          <w:rStyle w:val="NormalTok"/>
+        </w:rPr>
+        <w:t xml:space="preserve">            transforms.ToTensor(),</w:t>
+      </w:r>
+      <w:r>
+        <w:br/>
+      </w:r>
+      <w:r>
+        <w:rPr>
+          <w:rStyle w:val="NormalTok"/>
+        </w:rPr>
+        <w:t xml:space="preserve">            transforms.Normalize(mean</w:t>
+      </w:r>
+      <w:r>
+        <w:rPr>
+          <w:rStyle w:val="OperatorTok"/>
+        </w:rPr>
+        <w:t xml:space="preserve">=</w:t>
+      </w:r>
+      <w:r>
+        <w:rPr>
+          <w:rStyle w:val="NormalTok"/>
+        </w:rPr>
+        <w:t xml:space="preserve">(</w:t>
+      </w:r>
+      <w:r>
+        <w:rPr>
+          <w:rStyle w:val="FloatTok"/>
+        </w:rPr>
+        <w:t xml:space="preserve">0.485</w:t>
+      </w:r>
+      <w:r>
+        <w:rPr>
+          <w:rStyle w:val="NormalTok"/>
+        </w:rPr>
+        <w:t xml:space="preserve">, </w:t>
+      </w:r>
+      <w:r>
+        <w:rPr>
+          <w:rStyle w:val="FloatTok"/>
+        </w:rPr>
+        <w:t xml:space="preserve">0.456</w:t>
+      </w:r>
+      <w:r>
+        <w:rPr>
+          <w:rStyle w:val="NormalTok"/>
+        </w:rPr>
+        <w:t xml:space="preserve">, </w:t>
+      </w:r>
+      <w:r>
+        <w:rPr>
+          <w:rStyle w:val="FloatTok"/>
+        </w:rPr>
+        <w:t xml:space="preserve">0.406</w:t>
+      </w:r>
+      <w:r>
+        <w:rPr>
+          <w:rStyle w:val="NormalTok"/>
+        </w:rPr>
+        <w:t xml:space="preserve">), std</w:t>
+      </w:r>
+      <w:r>
+        <w:rPr>
+          <w:rStyle w:val="OperatorTok"/>
+        </w:rPr>
+        <w:t xml:space="preserve">=</w:t>
+      </w:r>
+      <w:r>
+        <w:rPr>
+          <w:rStyle w:val="NormalTok"/>
+        </w:rPr>
+        <w:t xml:space="preserve">(</w:t>
+      </w:r>
+      <w:r>
+        <w:rPr>
+          <w:rStyle w:val="FloatTok"/>
+        </w:rPr>
+        <w:t xml:space="preserve">0.229</w:t>
+      </w:r>
+      <w:r>
+        <w:rPr>
+          <w:rStyle w:val="NormalTok"/>
+        </w:rPr>
+        <w:t xml:space="preserve">, </w:t>
+      </w:r>
+      <w:r>
+        <w:rPr>
+          <w:rStyle w:val="FloatTok"/>
+        </w:rPr>
+        <w:t xml:space="preserve">0.224</w:t>
+      </w:r>
+      <w:r>
+        <w:rPr>
+          <w:rStyle w:val="NormalTok"/>
+        </w:rPr>
+        <w:t xml:space="preserve">, </w:t>
+      </w:r>
+      <w:r>
+        <w:rPr>
+          <w:rStyle w:val="FloatTok"/>
+        </w:rPr>
+        <w:t xml:space="preserve">0.225</w:t>
+      </w:r>
+      <w:r>
+        <w:rPr>
+          <w:rStyle w:val="NormalTok"/>
+        </w:rPr>
+        <w:t xml:space="preserve">)),</w:t>
+      </w:r>
+      <w:r>
+        <w:br/>
+      </w:r>
+      <w:r>
+        <w:rPr>
+          <w:rStyle w:val="NormalTok"/>
+        </w:rPr>
+        <w:t xml:space="preserve">        ]</w:t>
+      </w:r>
+      <w:r>
+        <w:br/>
+      </w:r>
+      <w:r>
+        <w:rPr>
+          <w:rStyle w:val="NormalTok"/>
+        </w:rPr>
+        <w:t xml:space="preserve">    )</w:t>
+      </w:r>
+      <w:r>
+        <w:br/>
+      </w:r>
+      <w:r>
+        <w:rPr>
+          <w:rStyle w:val="NormalTok"/>
+        </w:rPr>
+        <w:t xml:space="preserve">    </w:t>
+      </w:r>
+      <w:r>
+        <w:rPr>
+          <w:rStyle w:val="ControlFlowTok"/>
+        </w:rPr>
+        <w:t xml:space="preserve">return</w:t>
+      </w:r>
+      <w:r>
+        <w:rPr>
+          <w:rStyle w:val="NormalTok"/>
+        </w:rPr>
+        <w:t xml:space="preserve"> train_tf, val_tf</w:t>
       </w:r>
     </w:p>
     <w:p>

</xml_diff>